<commit_message>
Added ML Training Approach documentation
</commit_message>
<xml_diff>
--- a/docs/Deliverables/TaalAI_Model Training Pipeline.docx
+++ b/docs/Deliverables/TaalAI_Model Training Pipeline.docx
@@ -4,6 +4,9 @@
   <w:body>
     <w:p>
       <w:r>
+        <w:rPr>
+          <w:noProof/>
+        </w:rPr>
         <w:drawing>
           <wp:inline distT="0" distB="0" distL="0" distR="0" wp14:anchorId="1B5B6314" wp14:editId="3B85CC10">
             <wp:extent cx="8241780" cy="11319029"/>
@@ -46,6 +49,9 @@
         <w:spacing w:after="0" w:line="120" w:lineRule="auto"/>
       </w:pPr>
       <w:r>
+        <w:rPr>
+          <w:noProof/>
+        </w:rPr>
         <w:lastRenderedPageBreak/>
         <w:drawing>
           <wp:inline distT="0" distB="0" distL="0" distR="0" wp14:anchorId="3065D8D2" wp14:editId="01F4D969">
@@ -93,8 +99,11 @@
         </w:drawing>
       </w:r>
       <w:r>
+        <w:rPr>
+          <w:noProof/>
+        </w:rPr>
         <w:drawing>
-          <wp:inline distT="0" distB="0" distL="0" distR="0" wp14:anchorId="568B65F6" wp14:editId="352E3D92">
+          <wp:inline distT="0" distB="0" distL="0" distR="0" wp14:anchorId="568B65F6" wp14:editId="4597FD59">
             <wp:extent cx="8131946" cy="1388197"/>
             <wp:effectExtent l="0" t="0" r="2540" b="2540"/>
             <wp:docPr id="2118097935" name="Picture 1"/>
@@ -105,7 +114,7 @@
               <a:graphicData uri="http://schemas.openxmlformats.org/drawingml/2006/picture">
                 <pic:pic xmlns:pic="http://schemas.openxmlformats.org/drawingml/2006/picture">
                   <pic:nvPicPr>
-                    <pic:cNvPr id="2118097935" name=""/>
+                    <pic:cNvPr id="2118097935" name="Picture 1"/>
                     <pic:cNvPicPr/>
                   </pic:nvPicPr>
                   <pic:blipFill rotWithShape="1">
@@ -1476,4 +1485,10 @@
     </a:ext>
   </a:extLst>
 </a:theme>
+</file>
+
+<file path=docMetadata/LabelInfo.xml><?xml version="1.0" encoding="utf-8"?>
+<clbl:labelList xmlns:clbl="http://schemas.microsoft.com/office/2020/mipLabelMetadata">
+  <clbl:label id="{f6b6dd5b-f02f-441a-99a0-162ac5060bd2}" enabled="0" method="" siteId="{f6b6dd5b-f02f-441a-99a0-162ac5060bd2}" removed="1"/>
+</clbl:labelList>
 </file>
</xml_diff>